<commit_message>
Update site content, fix address line wrapping, ignore .idea
</commit_message>
<xml_diff>
--- a/Sruti Website Material.docx
+++ b/Sruti Website Material.docx
@@ -1,6 +1,6 @@
 
 <file path=word/document.xml><?xml version="1.0" encoding="utf-8"?>
-<w:document xmlns:wpc="http://schemas.microsoft.com/office/word/2010/wordprocessingCanvas" xmlns:cx="http://schemas.microsoft.com/office/drawing/2014/chartex" xmlns:cx1="http://schemas.microsoft.com/office/drawing/2015/9/8/chartex" xmlns:cx2="http://schemas.microsoft.com/office/drawing/2015/10/21/chartex" xmlns:cx3="http://schemas.microsoft.com/office/drawing/2016/5/9/chartex" xmlns:cx4="http://schemas.microsoft.com/office/drawing/2016/5/10/chartex" xmlns:cx5="http://schemas.microsoft.com/office/drawing/2016/5/11/chartex" xmlns:cx6="http://schemas.microsoft.com/office/drawing/2016/5/12/chartex" xmlns:cx7="http://schemas.microsoft.com/office/drawing/2016/5/13/chartex" xmlns:cx8="http://schemas.microsoft.com/office/drawing/2016/5/14/chartex" xmlns:mc="http://schemas.openxmlformats.org/markup-compatibility/2006" xmlns:aink="http://schemas.microsoft.com/office/drawing/2016/ink" xmlns:am3d="http://schemas.microsoft.com/office/drawing/2017/model3d" xmlns:o="urn:schemas-microsoft-com:office:office" xmlns:oel="http://schemas.microsoft.com/office/2019/extlst" xmlns:r="http://schemas.openxmlformats.org/officeDocument/2006/relationships" xmlns:m="http://schemas.openxmlformats.org/officeDocument/2006/math" xmlns:v="urn:schemas-microsoft-com:vml" xmlns:wp14="http://schemas.microsoft.com/office/word/2010/wordprocessingDrawing" xmlns:wp="http://schemas.openxmlformats.org/drawingml/2006/wordprocessingDrawing" xmlns:w10="urn:schemas-microsoft-com:office:word" xmlns:w="http://schemas.openxmlformats.org/wordprocessingml/2006/main" xmlns:w14="http://schemas.microsoft.com/office/word/2010/wordml" xmlns:w15="http://schemas.microsoft.com/office/word/2012/wordml" xmlns:w16cex="http://schemas.microsoft.com/office/word/2018/wordml/cex" xmlns:w16cid="http://schemas.microsoft.com/office/word/2016/wordml/cid" xmlns:w16="http://schemas.microsoft.com/office/word/2018/wordml" xmlns:w16du="http://schemas.microsoft.com/office/word/2023/wordml/word16du" xmlns:w16sdtdh="http://schemas.microsoft.com/office/word/2020/wordml/sdtdatahash" xmlns:w16sdtfl="http://schemas.microsoft.com/office/word/2024/wordml/sdtformatlock" xmlns:w16se="http://schemas.microsoft.com/office/word/2015/wordml/symex" xmlns:wpg="http://schemas.microsoft.com/office/word/2010/wordprocessingGroup" xmlns:wpi="http://schemas.microsoft.com/office/word/2010/wordprocessingInk" xmlns:wne="http://schemas.microsoft.com/office/word/2006/wordml" xmlns:wps="http://schemas.microsoft.com/office/word/2010/wordprocessingShape" mc:Ignorable="w14 w15 w16se w16cid w16 w16cex w16sdtdh w16sdtfl w16du wp14">
+<w:document xmlns:wpc="http://schemas.microsoft.com/office/word/2010/wordprocessingCanvas" xmlns:cx="http://schemas.microsoft.com/office/drawing/2014/chartex" xmlns:cx1="http://schemas.microsoft.com/office/drawing/2015/9/8/chartex" xmlns:cx2="http://schemas.microsoft.com/office/drawing/2015/10/21/chartex" xmlns:cx3="http://schemas.microsoft.com/office/drawing/2016/5/9/chartex" xmlns:cx4="http://schemas.microsoft.com/office/drawing/2016/5/10/chartex" xmlns:cx5="http://schemas.microsoft.com/office/drawing/2016/5/11/chartex" xmlns:cx6="http://schemas.microsoft.com/office/drawing/2016/5/12/chartex" xmlns:cx7="http://schemas.microsoft.com/office/drawing/2016/5/13/chartex" xmlns:cx8="http://schemas.microsoft.com/office/drawing/2016/5/14/chartex" xmlns:mc="http://schemas.openxmlformats.org/markup-compatibility/2006" xmlns:m="http://schemas.openxmlformats.org/officeDocument/2006/math" xmlns:aink="http://schemas.microsoft.com/office/drawing/2016/ink" xmlns:am3d="http://schemas.microsoft.com/office/drawing/2017/model3d" xmlns:oel="http://schemas.microsoft.com/office/2019/extlst" xmlns:r="http://schemas.openxmlformats.org/officeDocument/2006/relationships" xmlns:wp14="http://schemas.microsoft.com/office/word/2010/wordprocessingDrawing" xmlns:wp="http://schemas.openxmlformats.org/drawingml/2006/wordprocessingDrawing" xmlns:wpg="http://schemas.microsoft.com/office/word/2010/wordprocessingGroup" xmlns:wpi="http://schemas.microsoft.com/office/word/2010/wordprocessingInk" xmlns:wps="http://schemas.microsoft.com/office/word/2010/wordprocessingShape" xmlns:o="urn:schemas-microsoft-com:office:office" xmlns:v="urn:schemas-microsoft-com:vml" xmlns:w10="urn:schemas-microsoft-com:office:word" xmlns:w="http://schemas.openxmlformats.org/wordprocessingml/2006/main" xmlns:w14="http://schemas.microsoft.com/office/word/2010/wordml" xmlns:w15="http://schemas.microsoft.com/office/word/2012/wordml" xmlns:w16cex="http://schemas.microsoft.com/office/word/2018/wordml/cex" xmlns:w16cid="http://schemas.microsoft.com/office/word/2016/wordml/cid" xmlns:w16="http://schemas.microsoft.com/office/word/2018/wordml" xmlns:w16sdtdh="http://schemas.microsoft.com/office/word/2020/wordml/sdtdatahash" xmlns:w16sdtfl="http://schemas.microsoft.com/office/word/2024/wordml/sdtformatlock" xmlns:w16se="http://schemas.microsoft.com/office/word/2015/wordml/symex" xmlns:w16du="http://schemas.microsoft.com/office/word/2023/wordml/word16du" xmlns:wne="http://schemas.microsoft.com/office/word/2006/wordml" mc:Ignorable="w14 w15 w16se w16cid w16 w16cex w16sdtdh w16sdtfl w16du wp14">
   <w:body>
     <w:p>
       <w:pPr>
@@ -527,10 +527,64 @@
           </w:tcPr>
           <w:p>
             <w:pPr>
-              <w:jc w:val="center"/>
-            </w:pPr>
-            <w:r>
-              <w:t>UK</w:t>
+              <w:pStyle w:val="NormalWeb"/>
+              <w:spacing w:before="0" w:beforeAutospacing="0" w:after="0" w:afterAutospacing="0"/>
+            </w:pPr>
+            <w:r>
+              <w:rPr>
+                <w:rFonts w:ascii="Arial" w:hAnsi="Arial" w:cs="Arial"/>
+                <w:color w:val="1D2528"/>
+              </w:rPr>
+              <w:t xml:space="preserve">St. </w:t>
+            </w:r>
+            <w:proofErr w:type="spellStart"/>
+            <w:r>
+              <w:rPr>
+                <w:rFonts w:ascii="Arial" w:hAnsi="Arial" w:cs="Arial"/>
+                <w:color w:val="1D2528"/>
+              </w:rPr>
+              <w:t>Aidans</w:t>
+            </w:r>
+            <w:proofErr w:type="spellEnd"/>
+            <w:r>
+              <w:rPr>
+                <w:rFonts w:ascii="Arial" w:hAnsi="Arial" w:cs="Arial"/>
+                <w:color w:val="1D2528"/>
+              </w:rPr>
+              <w:t xml:space="preserve"> Community Centre</w:t>
+            </w:r>
+          </w:p>
+          <w:p>
+            <w:pPr>
+              <w:pStyle w:val="NormalWeb"/>
+              <w:spacing w:before="0" w:beforeAutospacing="0" w:after="0" w:afterAutospacing="0"/>
+            </w:pPr>
+            <w:r>
+              <w:rPr>
+                <w:rFonts w:ascii="Arial" w:hAnsi="Arial" w:cs="Arial"/>
+                <w:color w:val="1D2528"/>
+              </w:rPr>
+              <w:t>Princes Rd, Newcastle upon Tyne</w:t>
+            </w:r>
+          </w:p>
+          <w:p>
+            <w:pPr>
+              <w:pStyle w:val="NormalWeb"/>
+              <w:spacing w:before="0" w:beforeAutospacing="0" w:after="0" w:afterAutospacing="0"/>
+            </w:pPr>
+            <w:r>
+              <w:rPr>
+                <w:rFonts w:ascii="Arial" w:hAnsi="Arial" w:cs="Arial"/>
+                <w:color w:val="1D2528"/>
+              </w:rPr>
+              <w:t>NE3 5TT</w:t>
+            </w:r>
+            <w:r>
+              <w:rPr>
+                <w:rFonts w:ascii="Arial" w:hAnsi="Arial" w:cs="Arial"/>
+                <w:color w:val="1D2528"/>
+              </w:rPr>
+              <w:t xml:space="preserve"> , UK</w:t>
             </w:r>
           </w:p>
         </w:tc>
@@ -758,7 +812,11 @@
         <w:t xml:space="preserve">Students and family members of our school joined hands with Sri Sathya Sai Organisation CIO to plant 630 trees </w:t>
       </w:r>
       <w:r>
-        <w:t xml:space="preserve">together to plant 650 trees on 18th April 2026. A team of 45 devotees including 10 children started planting trees at 10am on a bright Saturday morning at Jarrow, South Shields, Newcastle upon Tyne. They were treated with chocolates; fresh fruits and cookies in the morning and a nice lunch in the afternoon. Bluetooth speakers playing </w:t>
+        <w:t xml:space="preserve">together to plant 650 trees on 18th April 2026. A team of 45 devotees including 10 children started planting trees at 10am on a bright Saturday morning at Jarrow, South Shields, Newcastle upon Tyne. They were treated </w:t>
+      </w:r>
+      <w:r>
+        <w:lastRenderedPageBreak/>
+        <w:t xml:space="preserve">with chocolates; fresh fruits and cookies in the morning and a nice lunch in the afternoon. Bluetooth speakers playing </w:t>
       </w:r>
       <w:r>
         <w:t>melodious, spiritual music</w:t>
@@ -774,11 +832,7 @@
       <w:proofErr w:type="spellEnd"/>
       <w:proofErr w:type="gramEnd"/>
       <w:r>
-        <w:t xml:space="preserve"> ice cream </w:t>
-      </w:r>
-      <w:r>
-        <w:lastRenderedPageBreak/>
-        <w:t>after the hard work. Special thanks to Living Woods Trust for their partnership in making this initiative possible.</w:t>
+        <w:t xml:space="preserve"> ice cream after the hard work. Special thanks to Living Woods Trust for their partnership in making this initiative possible.</w:t>
       </w:r>
     </w:p>
     <w:p>
@@ -936,7 +990,7 @@
 </file>
 
 <file path=word/styles.xml><?xml version="1.0" encoding="utf-8"?>
-<w:styles xmlns:mc="http://schemas.openxmlformats.org/markup-compatibility/2006" xmlns:r="http://schemas.openxmlformats.org/officeDocument/2006/relationships" xmlns:w="http://schemas.openxmlformats.org/wordprocessingml/2006/main" xmlns:w14="http://schemas.microsoft.com/office/word/2010/wordml" xmlns:w15="http://schemas.microsoft.com/office/word/2012/wordml" xmlns:w16cex="http://schemas.microsoft.com/office/word/2018/wordml/cex" xmlns:w16cid="http://schemas.microsoft.com/office/word/2016/wordml/cid" xmlns:w16="http://schemas.microsoft.com/office/word/2018/wordml" xmlns:w16du="http://schemas.microsoft.com/office/word/2023/wordml/word16du" xmlns:w16sdtdh="http://schemas.microsoft.com/office/word/2020/wordml/sdtdatahash" xmlns:w16sdtfl="http://schemas.microsoft.com/office/word/2024/wordml/sdtformatlock" xmlns:w16se="http://schemas.microsoft.com/office/word/2015/wordml/symex" mc:Ignorable="w14 w15 w16se w16cid w16 w16cex w16sdtdh w16sdtfl w16du">
+<w:styles xmlns:mc="http://schemas.openxmlformats.org/markup-compatibility/2006" xmlns:r="http://schemas.openxmlformats.org/officeDocument/2006/relationships" xmlns:w="http://schemas.openxmlformats.org/wordprocessingml/2006/main" xmlns:w14="http://schemas.microsoft.com/office/word/2010/wordml" xmlns:w15="http://schemas.microsoft.com/office/word/2012/wordml" xmlns:w16cex="http://schemas.microsoft.com/office/word/2018/wordml/cex" xmlns:w16cid="http://schemas.microsoft.com/office/word/2016/wordml/cid" xmlns:w16="http://schemas.microsoft.com/office/word/2018/wordml" xmlns:w16sdtdh="http://schemas.microsoft.com/office/word/2020/wordml/sdtdatahash" xmlns:w16sdtfl="http://schemas.microsoft.com/office/word/2024/wordml/sdtformatlock" xmlns:w16se="http://schemas.microsoft.com/office/word/2015/wordml/symex" xmlns:w16du="http://schemas.microsoft.com/office/word/2023/wordml/word16du" mc:Ignorable="w14 w15 w16se w16cid w16 w16cex w16sdtdh w16sdtfl w16du">
   <w:docDefaults>
     <w:rPrDefault>
       <w:rPr>
@@ -1871,6 +1925,22 @@
       </w:tblBorders>
     </w:tblPr>
   </w:style>
+  <w:style w:type="paragraph" w:styleId="NormalWeb">
+    <w:name w:val="Normal (Web)"/>
+    <w:basedOn w:val="Normal"/>
+    <w:uiPriority w:val="99"/>
+    <w:unhideWhenUsed/>
+    <w:rsid w:val="00D72EA9"/>
+    <w:pPr>
+      <w:spacing w:before="100" w:beforeAutospacing="1" w:after="100" w:afterAutospacing="1" w:line="240" w:lineRule="auto"/>
+    </w:pPr>
+    <w:rPr>
+      <w:rFonts w:ascii="Times New Roman" w:eastAsia="Times New Roman" w:hAnsi="Times New Roman" w:cs="Times New Roman"/>
+      <w:kern w:val="0"/>
+      <w:lang w:eastAsia="en-GB"/>
+      <w14:ligatures w14:val="none"/>
+    </w:rPr>
+  </w:style>
 </w:styles>
 </file>
 

</xml_diff>

<commit_message>
chore: update doc to reflect children vedam classes schedule
</commit_message>
<xml_diff>
--- a/Sruti Website Material.docx
+++ b/Sruti Website Material.docx
@@ -116,46 +116,59 @@
     </w:p>
     <w:p>
       <w:r>
-        <w:t xml:space="preserve">Vedic </w:t>
-      </w:r>
-      <w:r>
-        <w:t>mantras</w:t>
-      </w:r>
-      <w:r>
-        <w:t xml:space="preserve"> are taught by the process of repetition by trained teachers through “face-to-face” classes and online sessions. The meanings of the scriptures are explained to the students so that everyone understands that the </w:t>
-      </w:r>
-      <w:r>
-        <w:t xml:space="preserve">entire mankind is one family and there is no scope for discrimination, hatred, anger or animosity towards another human. </w:t>
-      </w:r>
-    </w:p>
-    <w:p>
-      <w:r>
-        <w:t>W</w:t>
-      </w:r>
-      <w:r>
-        <w:t xml:space="preserve">e have the following sessions happening at </w:t>
-      </w:r>
+        <w:t xml:space="preserve">Vedic mantras are taught by the process of repetition by trained teachers through “face-to-face” classes and online sessions. The meanings of the scriptures are explained to the students so that everyone understands that the entire mankind is one family and there is no scope for discrimination, hatred, anger or animosity towards another human. </w:t>
+      </w:r>
+    </w:p>
+    <w:p>
       <w:proofErr w:type="spellStart"/>
       <w:r>
         <w:t>Śruti</w:t>
       </w:r>
       <w:proofErr w:type="spellEnd"/>
       <w:r>
-        <w:t>.</w:t>
-      </w:r>
-      <w:r>
-        <w:t xml:space="preserve"> We are planning to start new sessions for children</w:t>
-      </w:r>
-    </w:p>
-    <w:p>
-      <w:r>
+        <w:t xml:space="preserve"> offers Vedam and Vedanta learning for children, adults and families through online and face-to-face sessions. Some online groups are available to registered participants only.</w:t>
+      </w:r>
+    </w:p>
+    <w:p>
+      <w:pPr>
+        <w:rPr>
+          <w:b/>
+          <w:bCs/>
+        </w:rPr>
+      </w:pPr>
+      <w:r>
+        <w:rPr>
+          <w:b/>
+          <w:bCs/>
+        </w:rPr>
+        <w:t>Adult &amp; Family Sessions</w:t>
+      </w:r>
+      <w:r>
+        <w:rPr>
+          <w:b/>
+          <w:bCs/>
+        </w:rPr>
         <w:t xml:space="preserve"> </w:t>
       </w:r>
+    </w:p>
+    <w:p>
+      <w:pPr>
+        <w:rPr>
+          <w:b/>
+          <w:bCs/>
+        </w:rPr>
+      </w:pPr>
     </w:p>
     <w:tbl>
       <w:tblPr>
-        <w:tblStyle w:val="TableGrid"/>
-        <w:tblW w:w="0" w:type="auto"/>
+        <w:tblW w:w="0" w:type="dxa"/>
+        <w:tblBorders>
+          <w:top w:val="single" w:sz="2" w:space="0" w:color="auto"/>
+          <w:left w:val="single" w:sz="2" w:space="0" w:color="auto"/>
+          <w:bottom w:val="single" w:sz="2" w:space="0" w:color="auto"/>
+          <w:right w:val="single" w:sz="2" w:space="0" w:color="auto"/>
+        </w:tblBorders>
+        <w:shd w:val="clear" w:color="auto" w:fill="FFFFFF"/>
         <w:tblLook w:val="04A0" w:firstRow="1" w:lastRow="0" w:firstColumn="1" w:lastColumn="0" w:noHBand="0" w:noVBand="1"/>
       </w:tblPr>
       <w:tblGrid>
@@ -170,36 +183,40 @@
         <w:tc>
           <w:tcPr>
             <w:tcW w:w="1502" w:type="dxa"/>
-          </w:tcPr>
-          <w:p>
-            <w:pPr>
-              <w:jc w:val="center"/>
+            <w:tcBorders>
+              <w:top w:val="single" w:sz="4" w:space="0" w:color="000000"/>
+              <w:left w:val="single" w:sz="4" w:space="0" w:color="000000"/>
+              <w:bottom w:val="single" w:sz="4" w:space="0" w:color="000000"/>
+              <w:right w:val="single" w:sz="4" w:space="0" w:color="000000"/>
+            </w:tcBorders>
+            <w:shd w:val="clear" w:color="auto" w:fill="FFFFFF"/>
+            <w:vAlign w:val="center"/>
+            <w:hideMark/>
+          </w:tcPr>
+          <w:p>
+            <w:r>
               <w:rPr>
                 <w:b/>
                 <w:bCs/>
               </w:rPr>
-            </w:pPr>
-            <w:r>
-              <w:rPr>
-                <w:b/>
-                <w:bCs/>
-              </w:rPr>
-              <w:t>Classes</w:t>
+              <w:t>Class</w:t>
             </w:r>
           </w:p>
         </w:tc>
         <w:tc>
           <w:tcPr>
             <w:tcW w:w="1502" w:type="dxa"/>
-          </w:tcPr>
-          <w:p>
-            <w:pPr>
-              <w:jc w:val="center"/>
-              <w:rPr>
-                <w:b/>
-                <w:bCs/>
-              </w:rPr>
-            </w:pPr>
+            <w:tcBorders>
+              <w:top w:val="single" w:sz="4" w:space="0" w:color="000000"/>
+              <w:left w:val="single" w:sz="4" w:space="0" w:color="000000"/>
+              <w:bottom w:val="single" w:sz="4" w:space="0" w:color="000000"/>
+              <w:right w:val="single" w:sz="4" w:space="0" w:color="000000"/>
+            </w:tcBorders>
+            <w:shd w:val="clear" w:color="auto" w:fill="FFFFFF"/>
+            <w:vAlign w:val="center"/>
+            <w:hideMark/>
+          </w:tcPr>
+          <w:p>
             <w:r>
               <w:rPr>
                 <w:b/>
@@ -212,15 +229,17 @@
         <w:tc>
           <w:tcPr>
             <w:tcW w:w="1503" w:type="dxa"/>
-          </w:tcPr>
-          <w:p>
-            <w:pPr>
-              <w:jc w:val="center"/>
-              <w:rPr>
-                <w:b/>
-                <w:bCs/>
-              </w:rPr>
-            </w:pPr>
+            <w:tcBorders>
+              <w:top w:val="single" w:sz="4" w:space="0" w:color="000000"/>
+              <w:left w:val="single" w:sz="4" w:space="0" w:color="000000"/>
+              <w:bottom w:val="single" w:sz="4" w:space="0" w:color="000000"/>
+              <w:right w:val="single" w:sz="4" w:space="0" w:color="000000"/>
+            </w:tcBorders>
+            <w:shd w:val="clear" w:color="auto" w:fill="FFFFFF"/>
+            <w:vAlign w:val="center"/>
+            <w:hideMark/>
+          </w:tcPr>
+          <w:p>
             <w:r>
               <w:rPr>
                 <w:b/>
@@ -233,15 +252,17 @@
         <w:tc>
           <w:tcPr>
             <w:tcW w:w="1503" w:type="dxa"/>
-          </w:tcPr>
-          <w:p>
-            <w:pPr>
-              <w:jc w:val="center"/>
-              <w:rPr>
-                <w:b/>
-                <w:bCs/>
-              </w:rPr>
-            </w:pPr>
+            <w:tcBorders>
+              <w:top w:val="single" w:sz="4" w:space="0" w:color="000000"/>
+              <w:left w:val="single" w:sz="4" w:space="0" w:color="000000"/>
+              <w:bottom w:val="single" w:sz="4" w:space="0" w:color="000000"/>
+              <w:right w:val="single" w:sz="4" w:space="0" w:color="000000"/>
+            </w:tcBorders>
+            <w:shd w:val="clear" w:color="auto" w:fill="FFFFFF"/>
+            <w:vAlign w:val="center"/>
+            <w:hideMark/>
+          </w:tcPr>
+          <w:p>
             <w:r>
               <w:rPr>
                 <w:b/>
@@ -254,15 +275,17 @@
         <w:tc>
           <w:tcPr>
             <w:tcW w:w="1503" w:type="dxa"/>
-          </w:tcPr>
-          <w:p>
-            <w:pPr>
-              <w:jc w:val="center"/>
-              <w:rPr>
-                <w:b/>
-                <w:bCs/>
-              </w:rPr>
-            </w:pPr>
+            <w:tcBorders>
+              <w:top w:val="single" w:sz="4" w:space="0" w:color="000000"/>
+              <w:left w:val="single" w:sz="4" w:space="0" w:color="000000"/>
+              <w:bottom w:val="single" w:sz="4" w:space="0" w:color="000000"/>
+              <w:right w:val="single" w:sz="4" w:space="0" w:color="000000"/>
+            </w:tcBorders>
+            <w:shd w:val="clear" w:color="auto" w:fill="FFFFFF"/>
+            <w:vAlign w:val="center"/>
+            <w:hideMark/>
+          </w:tcPr>
+          <w:p>
             <w:r>
               <w:rPr>
                 <w:b/>
@@ -275,21 +298,708 @@
         <w:tc>
           <w:tcPr>
             <w:tcW w:w="1503" w:type="dxa"/>
-          </w:tcPr>
-          <w:p>
-            <w:pPr>
-              <w:jc w:val="center"/>
+            <w:tcBorders>
+              <w:top w:val="single" w:sz="4" w:space="0" w:color="000000"/>
+              <w:left w:val="single" w:sz="4" w:space="0" w:color="000000"/>
+              <w:bottom w:val="single" w:sz="4" w:space="0" w:color="000000"/>
+              <w:right w:val="single" w:sz="4" w:space="0" w:color="000000"/>
+            </w:tcBorders>
+            <w:shd w:val="clear" w:color="auto" w:fill="FFFFFF"/>
+            <w:vAlign w:val="center"/>
+            <w:hideMark/>
+          </w:tcPr>
+          <w:p>
+            <w:r>
               <w:rPr>
                 <w:b/>
                 <w:bCs/>
               </w:rPr>
-            </w:pPr>
+              <w:t>Location</w:t>
+            </w:r>
+          </w:p>
+        </w:tc>
+      </w:tr>
+      <w:tr>
+        <w:tc>
+          <w:tcPr>
+            <w:tcW w:w="1502" w:type="dxa"/>
+            <w:tcBorders>
+              <w:top w:val="single" w:sz="4" w:space="0" w:color="000000"/>
+              <w:left w:val="single" w:sz="4" w:space="0" w:color="000000"/>
+              <w:bottom w:val="single" w:sz="4" w:space="0" w:color="000000"/>
+              <w:right w:val="single" w:sz="4" w:space="0" w:color="000000"/>
+            </w:tcBorders>
+            <w:shd w:val="clear" w:color="auto" w:fill="FFFFFF"/>
+            <w:vAlign w:val="center"/>
+            <w:hideMark/>
+          </w:tcPr>
+          <w:p>
+            <w:r>
+              <w:lastRenderedPageBreak/>
+              <w:t>Vedam &amp; Vedanta Classes</w:t>
+            </w:r>
+          </w:p>
+        </w:tc>
+        <w:tc>
+          <w:tcPr>
+            <w:tcW w:w="1502" w:type="dxa"/>
+            <w:tcBorders>
+              <w:top w:val="single" w:sz="4" w:space="0" w:color="000000"/>
+              <w:left w:val="single" w:sz="4" w:space="0" w:color="000000"/>
+              <w:bottom w:val="single" w:sz="4" w:space="0" w:color="000000"/>
+              <w:right w:val="single" w:sz="4" w:space="0" w:color="000000"/>
+            </w:tcBorders>
+            <w:shd w:val="clear" w:color="auto" w:fill="FFFFFF"/>
+            <w:vAlign w:val="center"/>
+            <w:hideMark/>
+          </w:tcPr>
+          <w:p>
+            <w:r>
+              <w:t>Online</w:t>
+            </w:r>
+          </w:p>
+        </w:tc>
+        <w:tc>
+          <w:tcPr>
+            <w:tcW w:w="1503" w:type="dxa"/>
+            <w:tcBorders>
+              <w:top w:val="single" w:sz="4" w:space="0" w:color="000000"/>
+              <w:left w:val="single" w:sz="4" w:space="0" w:color="000000"/>
+              <w:bottom w:val="single" w:sz="4" w:space="0" w:color="000000"/>
+              <w:right w:val="single" w:sz="4" w:space="0" w:color="000000"/>
+            </w:tcBorders>
+            <w:shd w:val="clear" w:color="auto" w:fill="FFFFFF"/>
+            <w:vAlign w:val="center"/>
+            <w:hideMark/>
+          </w:tcPr>
+          <w:p>
+            <w:r>
+              <w:t>Thursday</w:t>
+            </w:r>
+          </w:p>
+        </w:tc>
+        <w:tc>
+          <w:tcPr>
+            <w:tcW w:w="1503" w:type="dxa"/>
+            <w:tcBorders>
+              <w:top w:val="single" w:sz="4" w:space="0" w:color="000000"/>
+              <w:left w:val="single" w:sz="4" w:space="0" w:color="000000"/>
+              <w:bottom w:val="single" w:sz="4" w:space="0" w:color="000000"/>
+              <w:right w:val="single" w:sz="4" w:space="0" w:color="000000"/>
+            </w:tcBorders>
+            <w:shd w:val="clear" w:color="auto" w:fill="FFFFFF"/>
+            <w:vAlign w:val="center"/>
+            <w:hideMark/>
+          </w:tcPr>
+          <w:p>
+            <w:r>
+              <w:t>20:30–22:00</w:t>
+            </w:r>
+          </w:p>
+        </w:tc>
+        <w:tc>
+          <w:tcPr>
+            <w:tcW w:w="1503" w:type="dxa"/>
+            <w:tcBorders>
+              <w:top w:val="single" w:sz="4" w:space="0" w:color="000000"/>
+              <w:left w:val="single" w:sz="4" w:space="0" w:color="000000"/>
+              <w:bottom w:val="single" w:sz="4" w:space="0" w:color="000000"/>
+              <w:right w:val="single" w:sz="4" w:space="0" w:color="000000"/>
+            </w:tcBorders>
+            <w:shd w:val="clear" w:color="auto" w:fill="FFFFFF"/>
+            <w:vAlign w:val="center"/>
+            <w:hideMark/>
+          </w:tcPr>
+          <w:p>
+            <w:r>
+              <w:t>Adults</w:t>
+            </w:r>
+          </w:p>
+        </w:tc>
+        <w:tc>
+          <w:tcPr>
+            <w:tcW w:w="1503" w:type="dxa"/>
+            <w:tcBorders>
+              <w:top w:val="single" w:sz="4" w:space="0" w:color="000000"/>
+              <w:left w:val="single" w:sz="4" w:space="0" w:color="000000"/>
+              <w:bottom w:val="single" w:sz="4" w:space="0" w:color="000000"/>
+              <w:right w:val="single" w:sz="4" w:space="0" w:color="000000"/>
+            </w:tcBorders>
+            <w:shd w:val="clear" w:color="auto" w:fill="FFFFFF"/>
+            <w:vAlign w:val="center"/>
+            <w:hideMark/>
+          </w:tcPr>
+          <w:p>
+            <w:r>
+              <w:t>UK · USA · Ireland · India</w:t>
+            </w:r>
+          </w:p>
+        </w:tc>
+      </w:tr>
+      <w:tr>
+        <w:tc>
+          <w:tcPr>
+            <w:tcW w:w="1502" w:type="dxa"/>
+            <w:tcBorders>
+              <w:top w:val="single" w:sz="4" w:space="0" w:color="000000"/>
+              <w:left w:val="single" w:sz="4" w:space="0" w:color="000000"/>
+              <w:bottom w:val="single" w:sz="4" w:space="0" w:color="000000"/>
+              <w:right w:val="single" w:sz="4" w:space="0" w:color="000000"/>
+            </w:tcBorders>
+            <w:shd w:val="clear" w:color="auto" w:fill="FFFFFF"/>
+            <w:vAlign w:val="center"/>
+            <w:hideMark/>
+          </w:tcPr>
+          <w:p>
+            <w:r>
+              <w:t>Vedam Classes</w:t>
+            </w:r>
+            <w:r>
+              <w:br/>
+              <w:t>Registered only</w:t>
+            </w:r>
+          </w:p>
+        </w:tc>
+        <w:tc>
+          <w:tcPr>
+            <w:tcW w:w="1502" w:type="dxa"/>
+            <w:tcBorders>
+              <w:top w:val="single" w:sz="4" w:space="0" w:color="000000"/>
+              <w:left w:val="single" w:sz="4" w:space="0" w:color="000000"/>
+              <w:bottom w:val="single" w:sz="4" w:space="0" w:color="000000"/>
+              <w:right w:val="single" w:sz="4" w:space="0" w:color="000000"/>
+            </w:tcBorders>
+            <w:shd w:val="clear" w:color="auto" w:fill="FFFFFF"/>
+            <w:vAlign w:val="center"/>
+            <w:hideMark/>
+          </w:tcPr>
+          <w:p>
+            <w:r>
+              <w:t>Online</w:t>
+            </w:r>
+          </w:p>
+        </w:tc>
+        <w:tc>
+          <w:tcPr>
+            <w:tcW w:w="1503" w:type="dxa"/>
+            <w:tcBorders>
+              <w:top w:val="single" w:sz="4" w:space="0" w:color="000000"/>
+              <w:left w:val="single" w:sz="4" w:space="0" w:color="000000"/>
+              <w:bottom w:val="single" w:sz="4" w:space="0" w:color="000000"/>
+              <w:right w:val="single" w:sz="4" w:space="0" w:color="000000"/>
+            </w:tcBorders>
+            <w:shd w:val="clear" w:color="auto" w:fill="FFFFFF"/>
+            <w:vAlign w:val="center"/>
+            <w:hideMark/>
+          </w:tcPr>
+          <w:p>
+            <w:r>
+              <w:t>Friday</w:t>
+            </w:r>
+          </w:p>
+        </w:tc>
+        <w:tc>
+          <w:tcPr>
+            <w:tcW w:w="1503" w:type="dxa"/>
+            <w:tcBorders>
+              <w:top w:val="single" w:sz="4" w:space="0" w:color="000000"/>
+              <w:left w:val="single" w:sz="4" w:space="0" w:color="000000"/>
+              <w:bottom w:val="single" w:sz="4" w:space="0" w:color="000000"/>
+              <w:right w:val="single" w:sz="4" w:space="0" w:color="000000"/>
+            </w:tcBorders>
+            <w:shd w:val="clear" w:color="auto" w:fill="FFFFFF"/>
+            <w:vAlign w:val="center"/>
+            <w:hideMark/>
+          </w:tcPr>
+          <w:p>
+            <w:r>
+              <w:t>11:30–12:30</w:t>
+            </w:r>
+          </w:p>
+        </w:tc>
+        <w:tc>
+          <w:tcPr>
+            <w:tcW w:w="1503" w:type="dxa"/>
+            <w:tcBorders>
+              <w:top w:val="single" w:sz="4" w:space="0" w:color="000000"/>
+              <w:left w:val="single" w:sz="4" w:space="0" w:color="000000"/>
+              <w:bottom w:val="single" w:sz="4" w:space="0" w:color="000000"/>
+              <w:right w:val="single" w:sz="4" w:space="0" w:color="000000"/>
+            </w:tcBorders>
+            <w:shd w:val="clear" w:color="auto" w:fill="FFFFFF"/>
+            <w:vAlign w:val="center"/>
+            <w:hideMark/>
+          </w:tcPr>
+          <w:p>
+            <w:r>
+              <w:t>Adults</w:t>
+            </w:r>
+          </w:p>
+        </w:tc>
+        <w:tc>
+          <w:tcPr>
+            <w:tcW w:w="1503" w:type="dxa"/>
+            <w:tcBorders>
+              <w:top w:val="single" w:sz="4" w:space="0" w:color="000000"/>
+              <w:left w:val="single" w:sz="4" w:space="0" w:color="000000"/>
+              <w:bottom w:val="single" w:sz="4" w:space="0" w:color="000000"/>
+              <w:right w:val="single" w:sz="4" w:space="0" w:color="000000"/>
+            </w:tcBorders>
+            <w:shd w:val="clear" w:color="auto" w:fill="FFFFFF"/>
+            <w:vAlign w:val="center"/>
+            <w:hideMark/>
+          </w:tcPr>
+          <w:p>
+            <w:r>
+              <w:t>Mysore, Karnataka, India</w:t>
+            </w:r>
+          </w:p>
+        </w:tc>
+      </w:tr>
+      <w:tr>
+        <w:tc>
+          <w:tcPr>
+            <w:tcW w:w="1502" w:type="dxa"/>
+            <w:tcBorders>
+              <w:top w:val="single" w:sz="4" w:space="0" w:color="000000"/>
+              <w:left w:val="single" w:sz="4" w:space="0" w:color="000000"/>
+              <w:bottom w:val="single" w:sz="4" w:space="0" w:color="000000"/>
+              <w:right w:val="single" w:sz="4" w:space="0" w:color="000000"/>
+            </w:tcBorders>
+            <w:shd w:val="clear" w:color="auto" w:fill="FFFFFF"/>
+            <w:vAlign w:val="center"/>
+            <w:hideMark/>
+          </w:tcPr>
+          <w:p>
+            <w:r>
+              <w:t>Vedam Classes</w:t>
+            </w:r>
+          </w:p>
+        </w:tc>
+        <w:tc>
+          <w:tcPr>
+            <w:tcW w:w="1502" w:type="dxa"/>
+            <w:tcBorders>
+              <w:top w:val="single" w:sz="4" w:space="0" w:color="000000"/>
+              <w:left w:val="single" w:sz="4" w:space="0" w:color="000000"/>
+              <w:bottom w:val="single" w:sz="4" w:space="0" w:color="000000"/>
+              <w:right w:val="single" w:sz="4" w:space="0" w:color="000000"/>
+            </w:tcBorders>
+            <w:shd w:val="clear" w:color="auto" w:fill="FFFFFF"/>
+            <w:vAlign w:val="center"/>
+            <w:hideMark/>
+          </w:tcPr>
+          <w:p>
+            <w:r>
+              <w:t>Face-to-Face</w:t>
+            </w:r>
+          </w:p>
+        </w:tc>
+        <w:tc>
+          <w:tcPr>
+            <w:tcW w:w="1503" w:type="dxa"/>
+            <w:tcBorders>
+              <w:top w:val="single" w:sz="4" w:space="0" w:color="000000"/>
+              <w:left w:val="single" w:sz="4" w:space="0" w:color="000000"/>
+              <w:bottom w:val="single" w:sz="4" w:space="0" w:color="000000"/>
+              <w:right w:val="single" w:sz="4" w:space="0" w:color="000000"/>
+            </w:tcBorders>
+            <w:shd w:val="clear" w:color="auto" w:fill="FFFFFF"/>
+            <w:vAlign w:val="center"/>
+            <w:hideMark/>
+          </w:tcPr>
+          <w:p>
+            <w:r>
+              <w:t>Saturday</w:t>
+            </w:r>
+          </w:p>
+        </w:tc>
+        <w:tc>
+          <w:tcPr>
+            <w:tcW w:w="1503" w:type="dxa"/>
+            <w:tcBorders>
+              <w:top w:val="single" w:sz="4" w:space="0" w:color="000000"/>
+              <w:left w:val="single" w:sz="4" w:space="0" w:color="000000"/>
+              <w:bottom w:val="single" w:sz="4" w:space="0" w:color="000000"/>
+              <w:right w:val="single" w:sz="4" w:space="0" w:color="000000"/>
+            </w:tcBorders>
+            <w:shd w:val="clear" w:color="auto" w:fill="FFFFFF"/>
+            <w:vAlign w:val="center"/>
+            <w:hideMark/>
+          </w:tcPr>
+          <w:p>
+            <w:r>
+              <w:t>15:30–16:30</w:t>
+            </w:r>
+          </w:p>
+        </w:tc>
+        <w:tc>
+          <w:tcPr>
+            <w:tcW w:w="1503" w:type="dxa"/>
+            <w:tcBorders>
+              <w:top w:val="single" w:sz="4" w:space="0" w:color="000000"/>
+              <w:left w:val="single" w:sz="4" w:space="0" w:color="000000"/>
+              <w:bottom w:val="single" w:sz="4" w:space="0" w:color="000000"/>
+              <w:right w:val="single" w:sz="4" w:space="0" w:color="000000"/>
+            </w:tcBorders>
+            <w:shd w:val="clear" w:color="auto" w:fill="FFFFFF"/>
+            <w:vAlign w:val="center"/>
+            <w:hideMark/>
+          </w:tcPr>
+          <w:p>
+            <w:r>
+              <w:t>Children &amp; Adults</w:t>
+            </w:r>
+          </w:p>
+        </w:tc>
+        <w:tc>
+          <w:tcPr>
+            <w:tcW w:w="1503" w:type="dxa"/>
+            <w:tcBorders>
+              <w:top w:val="single" w:sz="4" w:space="0" w:color="000000"/>
+              <w:left w:val="single" w:sz="4" w:space="0" w:color="000000"/>
+              <w:bottom w:val="single" w:sz="4" w:space="0" w:color="000000"/>
+              <w:right w:val="single" w:sz="4" w:space="0" w:color="000000"/>
+            </w:tcBorders>
+            <w:shd w:val="clear" w:color="auto" w:fill="FFFFFF"/>
+            <w:vAlign w:val="center"/>
+            <w:hideMark/>
+          </w:tcPr>
+          <w:p>
+            <w:r>
+              <w:t xml:space="preserve">St. </w:t>
+            </w:r>
+            <w:proofErr w:type="spellStart"/>
+            <w:r>
+              <w:t>Aidans</w:t>
+            </w:r>
+            <w:proofErr w:type="spellEnd"/>
+            <w:r>
+              <w:t xml:space="preserve"> Community Centre</w:t>
+            </w:r>
+            <w:r>
+              <w:br/>
+              <w:t>Princes Rd, Newcastle upon Tyne</w:t>
+            </w:r>
+            <w:r>
+              <w:br/>
+              <w:t>NE3 5TT, UK</w:t>
+            </w:r>
+          </w:p>
+        </w:tc>
+      </w:tr>
+      <w:tr>
+        <w:tc>
+          <w:tcPr>
+            <w:tcW w:w="1502" w:type="dxa"/>
+            <w:tcBorders>
+              <w:top w:val="single" w:sz="4" w:space="0" w:color="000000"/>
+              <w:left w:val="single" w:sz="4" w:space="0" w:color="000000"/>
+              <w:bottom w:val="single" w:sz="4" w:space="0" w:color="000000"/>
+              <w:right w:val="single" w:sz="4" w:space="0" w:color="000000"/>
+            </w:tcBorders>
+            <w:shd w:val="clear" w:color="auto" w:fill="FFFFFF"/>
+            <w:vAlign w:val="center"/>
+            <w:hideMark/>
+          </w:tcPr>
+          <w:p>
+            <w:r>
+              <w:t>Dharma Sundays</w:t>
+            </w:r>
+          </w:p>
+        </w:tc>
+        <w:tc>
+          <w:tcPr>
+            <w:tcW w:w="1502" w:type="dxa"/>
+            <w:tcBorders>
+              <w:top w:val="single" w:sz="4" w:space="0" w:color="000000"/>
+              <w:left w:val="single" w:sz="4" w:space="0" w:color="000000"/>
+              <w:bottom w:val="single" w:sz="4" w:space="0" w:color="000000"/>
+              <w:right w:val="single" w:sz="4" w:space="0" w:color="000000"/>
+            </w:tcBorders>
+            <w:shd w:val="clear" w:color="auto" w:fill="FFFFFF"/>
+            <w:vAlign w:val="center"/>
+            <w:hideMark/>
+          </w:tcPr>
+          <w:p>
+            <w:r>
+              <w:t>Face-to-Face</w:t>
+            </w:r>
+          </w:p>
+        </w:tc>
+        <w:tc>
+          <w:tcPr>
+            <w:tcW w:w="1503" w:type="dxa"/>
+            <w:tcBorders>
+              <w:top w:val="single" w:sz="4" w:space="0" w:color="000000"/>
+              <w:left w:val="single" w:sz="4" w:space="0" w:color="000000"/>
+              <w:bottom w:val="single" w:sz="4" w:space="0" w:color="000000"/>
+              <w:right w:val="single" w:sz="4" w:space="0" w:color="000000"/>
+            </w:tcBorders>
+            <w:shd w:val="clear" w:color="auto" w:fill="FFFFFF"/>
+            <w:vAlign w:val="center"/>
+            <w:hideMark/>
+          </w:tcPr>
+          <w:p>
+            <w:r>
+              <w:t>Sunday</w:t>
+            </w:r>
+          </w:p>
+        </w:tc>
+        <w:tc>
+          <w:tcPr>
+            <w:tcW w:w="1503" w:type="dxa"/>
+            <w:tcBorders>
+              <w:top w:val="single" w:sz="4" w:space="0" w:color="000000"/>
+              <w:left w:val="single" w:sz="4" w:space="0" w:color="000000"/>
+              <w:bottom w:val="single" w:sz="4" w:space="0" w:color="000000"/>
+              <w:right w:val="single" w:sz="4" w:space="0" w:color="000000"/>
+            </w:tcBorders>
+            <w:shd w:val="clear" w:color="auto" w:fill="FFFFFF"/>
+            <w:vAlign w:val="center"/>
+            <w:hideMark/>
+          </w:tcPr>
+          <w:p>
+            <w:r>
+              <w:t>11:30–13:00</w:t>
+            </w:r>
+          </w:p>
+        </w:tc>
+        <w:tc>
+          <w:tcPr>
+            <w:tcW w:w="1503" w:type="dxa"/>
+            <w:tcBorders>
+              <w:top w:val="single" w:sz="4" w:space="0" w:color="000000"/>
+              <w:left w:val="single" w:sz="4" w:space="0" w:color="000000"/>
+              <w:bottom w:val="single" w:sz="4" w:space="0" w:color="000000"/>
+              <w:right w:val="single" w:sz="4" w:space="0" w:color="000000"/>
+            </w:tcBorders>
+            <w:shd w:val="clear" w:color="auto" w:fill="FFFFFF"/>
+            <w:vAlign w:val="center"/>
+            <w:hideMark/>
+          </w:tcPr>
+          <w:p>
+            <w:r>
+              <w:t>Children &amp; Parents</w:t>
+            </w:r>
+          </w:p>
+        </w:tc>
+        <w:tc>
+          <w:tcPr>
+            <w:tcW w:w="1503" w:type="dxa"/>
+            <w:tcBorders>
+              <w:top w:val="single" w:sz="4" w:space="0" w:color="000000"/>
+              <w:left w:val="single" w:sz="4" w:space="0" w:color="000000"/>
+              <w:bottom w:val="single" w:sz="4" w:space="0" w:color="000000"/>
+              <w:right w:val="single" w:sz="4" w:space="0" w:color="000000"/>
+            </w:tcBorders>
+            <w:shd w:val="clear" w:color="auto" w:fill="FFFFFF"/>
+            <w:vAlign w:val="center"/>
+            <w:hideMark/>
+          </w:tcPr>
+          <w:p>
+            <w:r>
+              <w:t>Hindu Temple Newcastle</w:t>
+            </w:r>
+            <w:r>
+              <w:br/>
+              <w:t>172 West Rd, Newcastle upon Tyne</w:t>
+            </w:r>
+            <w:r>
+              <w:br/>
+              <w:t>NE4 9QB, UK</w:t>
+            </w:r>
+          </w:p>
+        </w:tc>
+      </w:tr>
+    </w:tbl>
+    <w:p/>
+    <w:p>
+      <w:pPr>
+        <w:rPr>
+          <w:b/>
+          <w:bCs/>
+        </w:rPr>
+      </w:pPr>
+      <w:r>
+        <w:rPr>
+          <w:b/>
+          <w:bCs/>
+        </w:rPr>
+        <w:t>Children's Vedam Classes</w:t>
+      </w:r>
+    </w:p>
+    <w:p>
+      <w:pPr>
+        <w:rPr>
+          <w:i/>
+          <w:iCs/>
+        </w:rPr>
+      </w:pPr>
+      <w:r>
+        <w:rPr>
+          <w:i/>
+          <w:iCs/>
+        </w:rPr>
+        <w:t>Weekly online Vedam sessions for registered children.</w:t>
+      </w:r>
+    </w:p>
+    <w:tbl>
+      <w:tblPr>
+        <w:tblW w:w="0" w:type="dxa"/>
+        <w:tblBorders>
+          <w:top w:val="single" w:sz="2" w:space="0" w:color="auto"/>
+          <w:left w:val="single" w:sz="2" w:space="0" w:color="auto"/>
+          <w:bottom w:val="single" w:sz="2" w:space="0" w:color="auto"/>
+          <w:right w:val="single" w:sz="2" w:space="0" w:color="auto"/>
+        </w:tblBorders>
+        <w:shd w:val="clear" w:color="auto" w:fill="FFFFFF"/>
+        <w:tblLook w:val="04A0" w:firstRow="1" w:lastRow="0" w:firstColumn="1" w:lastColumn="0" w:noHBand="0" w:noVBand="1"/>
+      </w:tblPr>
+      <w:tblGrid>
+        <w:gridCol w:w="1502"/>
+        <w:gridCol w:w="1502"/>
+        <w:gridCol w:w="1504"/>
+        <w:gridCol w:w="1502"/>
+        <w:gridCol w:w="1503"/>
+        <w:gridCol w:w="1503"/>
+      </w:tblGrid>
+      <w:tr>
+        <w:tc>
+          <w:tcPr>
+            <w:tcW w:w="1504" w:type="dxa"/>
+            <w:tcBorders>
+              <w:top w:val="single" w:sz="4" w:space="0" w:color="000000"/>
+              <w:left w:val="single" w:sz="4" w:space="0" w:color="000000"/>
+              <w:bottom w:val="single" w:sz="4" w:space="0" w:color="000000"/>
+              <w:right w:val="single" w:sz="4" w:space="0" w:color="000000"/>
+            </w:tcBorders>
+            <w:shd w:val="clear" w:color="auto" w:fill="FFFFFF"/>
+            <w:vAlign w:val="center"/>
+            <w:hideMark/>
+          </w:tcPr>
+          <w:p>
             <w:r>
               <w:rPr>
                 <w:b/>
                 <w:bCs/>
               </w:rPr>
-              <w:t>Participant Countries</w:t>
+              <w:t>Class</w:t>
+            </w:r>
+          </w:p>
+        </w:tc>
+        <w:tc>
+          <w:tcPr>
+            <w:tcW w:w="1504" w:type="dxa"/>
+            <w:tcBorders>
+              <w:top w:val="single" w:sz="4" w:space="0" w:color="000000"/>
+              <w:left w:val="single" w:sz="4" w:space="0" w:color="000000"/>
+              <w:bottom w:val="single" w:sz="4" w:space="0" w:color="000000"/>
+              <w:right w:val="single" w:sz="4" w:space="0" w:color="000000"/>
+            </w:tcBorders>
+            <w:shd w:val="clear" w:color="auto" w:fill="FFFFFF"/>
+            <w:vAlign w:val="center"/>
+            <w:hideMark/>
+          </w:tcPr>
+          <w:p>
+            <w:r>
+              <w:rPr>
+                <w:b/>
+                <w:bCs/>
+              </w:rPr>
+              <w:t>Type</w:t>
+            </w:r>
+          </w:p>
+        </w:tc>
+        <w:tc>
+          <w:tcPr>
+            <w:tcW w:w="1504" w:type="dxa"/>
+            <w:tcBorders>
+              <w:top w:val="single" w:sz="4" w:space="0" w:color="000000"/>
+              <w:left w:val="single" w:sz="4" w:space="0" w:color="000000"/>
+              <w:bottom w:val="single" w:sz="4" w:space="0" w:color="000000"/>
+              <w:right w:val="single" w:sz="4" w:space="0" w:color="000000"/>
+            </w:tcBorders>
+            <w:shd w:val="clear" w:color="auto" w:fill="FFFFFF"/>
+            <w:vAlign w:val="center"/>
+            <w:hideMark/>
+          </w:tcPr>
+          <w:p>
+            <w:r>
+              <w:rPr>
+                <w:b/>
+                <w:bCs/>
+              </w:rPr>
+              <w:t>Day</w:t>
+            </w:r>
+          </w:p>
+        </w:tc>
+        <w:tc>
+          <w:tcPr>
+            <w:tcW w:w="1504" w:type="dxa"/>
+            <w:tcBorders>
+              <w:top w:val="single" w:sz="4" w:space="0" w:color="000000"/>
+              <w:left w:val="single" w:sz="4" w:space="0" w:color="000000"/>
+              <w:bottom w:val="single" w:sz="4" w:space="0" w:color="000000"/>
+              <w:right w:val="single" w:sz="4" w:space="0" w:color="000000"/>
+            </w:tcBorders>
+            <w:shd w:val="clear" w:color="auto" w:fill="FFFFFF"/>
+            <w:vAlign w:val="center"/>
+            <w:hideMark/>
+          </w:tcPr>
+          <w:p>
+            <w:r>
+              <w:rPr>
+                <w:b/>
+                <w:bCs/>
+              </w:rPr>
+              <w:t>Time</w:t>
+            </w:r>
+          </w:p>
+        </w:tc>
+        <w:tc>
+          <w:tcPr>
+            <w:tcW w:w="1504" w:type="dxa"/>
+            <w:tcBorders>
+              <w:top w:val="single" w:sz="4" w:space="0" w:color="000000"/>
+              <w:left w:val="single" w:sz="4" w:space="0" w:color="000000"/>
+              <w:bottom w:val="single" w:sz="4" w:space="0" w:color="000000"/>
+              <w:right w:val="single" w:sz="4" w:space="0" w:color="000000"/>
+            </w:tcBorders>
+            <w:shd w:val="clear" w:color="auto" w:fill="FFFFFF"/>
+            <w:vAlign w:val="center"/>
+            <w:hideMark/>
+          </w:tcPr>
+          <w:p>
+            <w:r>
+              <w:rPr>
+                <w:b/>
+                <w:bCs/>
+              </w:rPr>
+              <w:t>Age Group</w:t>
+            </w:r>
+          </w:p>
+        </w:tc>
+        <w:tc>
+          <w:tcPr>
+            <w:tcW w:w="1504" w:type="dxa"/>
+            <w:tcBorders>
+              <w:top w:val="single" w:sz="4" w:space="0" w:color="000000"/>
+              <w:left w:val="single" w:sz="4" w:space="0" w:color="000000"/>
+              <w:bottom w:val="single" w:sz="4" w:space="0" w:color="000000"/>
+              <w:right w:val="single" w:sz="4" w:space="0" w:color="000000"/>
+            </w:tcBorders>
+            <w:shd w:val="clear" w:color="auto" w:fill="FFFFFF"/>
+            <w:vAlign w:val="center"/>
+            <w:hideMark/>
+          </w:tcPr>
+          <w:p>
+            <w:r>
+              <w:rPr>
+                <w:b/>
+                <w:bCs/>
+              </w:rPr>
+              <w:t>Location</w:t>
             </w:r>
           </w:p>
         </w:tc>
@@ -297,25 +1007,41 @@
       <w:tr>
         <w:tc>
           <w:tcPr>
-            <w:tcW w:w="1502" w:type="dxa"/>
-          </w:tcPr>
-          <w:p>
-            <w:pPr>
-              <w:jc w:val="center"/>
-            </w:pPr>
-            <w:r>
-              <w:t>Vedam &amp; Vedanta Classes</w:t>
-            </w:r>
-          </w:p>
-        </w:tc>
-        <w:tc>
-          <w:tcPr>
-            <w:tcW w:w="1502" w:type="dxa"/>
-          </w:tcPr>
-          <w:p>
-            <w:pPr>
-              <w:jc w:val="center"/>
-            </w:pPr>
+            <w:tcW w:w="1504" w:type="dxa"/>
+            <w:tcBorders>
+              <w:top w:val="single" w:sz="4" w:space="0" w:color="000000"/>
+              <w:left w:val="single" w:sz="4" w:space="0" w:color="000000"/>
+              <w:bottom w:val="single" w:sz="4" w:space="0" w:color="000000"/>
+              <w:right w:val="single" w:sz="4" w:space="0" w:color="000000"/>
+            </w:tcBorders>
+            <w:shd w:val="clear" w:color="auto" w:fill="FFFFFF"/>
+            <w:vAlign w:val="center"/>
+            <w:hideMark/>
+          </w:tcPr>
+          <w:p>
+            <w:r>
+              <w:t>Group 1</w:t>
+            </w:r>
+            <w:r>
+              <w:br/>
+              <w:t>Registered only</w:t>
+            </w:r>
+          </w:p>
+        </w:tc>
+        <w:tc>
+          <w:tcPr>
+            <w:tcW w:w="1504" w:type="dxa"/>
+            <w:tcBorders>
+              <w:top w:val="single" w:sz="4" w:space="0" w:color="000000"/>
+              <w:left w:val="single" w:sz="4" w:space="0" w:color="000000"/>
+              <w:bottom w:val="single" w:sz="4" w:space="0" w:color="000000"/>
+              <w:right w:val="single" w:sz="4" w:space="0" w:color="000000"/>
+            </w:tcBorders>
+            <w:shd w:val="clear" w:color="auto" w:fill="FFFFFF"/>
+            <w:vAlign w:val="center"/>
+            <w:hideMark/>
+          </w:tcPr>
+          <w:p>
             <w:r>
               <w:t>Online</w:t>
             </w:r>
@@ -323,12 +1049,18 @@
         </w:tc>
         <w:tc>
           <w:tcPr>
-            <w:tcW w:w="1503" w:type="dxa"/>
-          </w:tcPr>
-          <w:p>
-            <w:pPr>
-              <w:jc w:val="center"/>
-            </w:pPr>
+            <w:tcW w:w="1504" w:type="dxa"/>
+            <w:tcBorders>
+              <w:top w:val="single" w:sz="4" w:space="0" w:color="000000"/>
+              <w:left w:val="single" w:sz="4" w:space="0" w:color="000000"/>
+              <w:bottom w:val="single" w:sz="4" w:space="0" w:color="000000"/>
+              <w:right w:val="single" w:sz="4" w:space="0" w:color="000000"/>
+            </w:tcBorders>
+            <w:shd w:val="clear" w:color="auto" w:fill="FFFFFF"/>
+            <w:vAlign w:val="center"/>
+            <w:hideMark/>
+          </w:tcPr>
+          <w:p>
             <w:r>
               <w:t>Thursday</w:t>
             </w:r>
@@ -336,40 +1068,58 @@
         </w:tc>
         <w:tc>
           <w:tcPr>
-            <w:tcW w:w="1503" w:type="dxa"/>
-          </w:tcPr>
-          <w:p>
-            <w:pPr>
-              <w:jc w:val="center"/>
-            </w:pPr>
-            <w:r>
-              <w:t>20.30-22.00hrs</w:t>
-            </w:r>
-          </w:p>
-        </w:tc>
-        <w:tc>
-          <w:tcPr>
-            <w:tcW w:w="1503" w:type="dxa"/>
-          </w:tcPr>
-          <w:p>
-            <w:pPr>
-              <w:jc w:val="center"/>
-            </w:pPr>
-            <w:r>
-              <w:t>Adults</w:t>
-            </w:r>
-          </w:p>
-        </w:tc>
-        <w:tc>
-          <w:tcPr>
-            <w:tcW w:w="1503" w:type="dxa"/>
-          </w:tcPr>
-          <w:p>
-            <w:pPr>
-              <w:jc w:val="center"/>
-            </w:pPr>
-            <w:r>
-              <w:t>UK; USA; Ireland and India</w:t>
+            <w:tcW w:w="1504" w:type="dxa"/>
+            <w:tcBorders>
+              <w:top w:val="single" w:sz="4" w:space="0" w:color="000000"/>
+              <w:left w:val="single" w:sz="4" w:space="0" w:color="000000"/>
+              <w:bottom w:val="single" w:sz="4" w:space="0" w:color="000000"/>
+              <w:right w:val="single" w:sz="4" w:space="0" w:color="000000"/>
+            </w:tcBorders>
+            <w:shd w:val="clear" w:color="auto" w:fill="FFFFFF"/>
+            <w:vAlign w:val="center"/>
+            <w:hideMark/>
+          </w:tcPr>
+          <w:p>
+            <w:r>
+              <w:t>19:30–20:30</w:t>
+            </w:r>
+          </w:p>
+        </w:tc>
+        <w:tc>
+          <w:tcPr>
+            <w:tcW w:w="1504" w:type="dxa"/>
+            <w:tcBorders>
+              <w:top w:val="single" w:sz="4" w:space="0" w:color="000000"/>
+              <w:left w:val="single" w:sz="4" w:space="0" w:color="000000"/>
+              <w:bottom w:val="single" w:sz="4" w:space="0" w:color="000000"/>
+              <w:right w:val="single" w:sz="4" w:space="0" w:color="000000"/>
+            </w:tcBorders>
+            <w:shd w:val="clear" w:color="auto" w:fill="FFFFFF"/>
+            <w:vAlign w:val="center"/>
+            <w:hideMark/>
+          </w:tcPr>
+          <w:p>
+            <w:r>
+              <w:t>Children</w:t>
+            </w:r>
+          </w:p>
+        </w:tc>
+        <w:tc>
+          <w:tcPr>
+            <w:tcW w:w="1504" w:type="dxa"/>
+            <w:tcBorders>
+              <w:top w:val="single" w:sz="4" w:space="0" w:color="000000"/>
+              <w:left w:val="single" w:sz="4" w:space="0" w:color="000000"/>
+              <w:bottom w:val="single" w:sz="4" w:space="0" w:color="000000"/>
+              <w:right w:val="single" w:sz="4" w:space="0" w:color="000000"/>
+            </w:tcBorders>
+            <w:shd w:val="clear" w:color="auto" w:fill="FFFFFF"/>
+            <w:vAlign w:val="center"/>
+            <w:hideMark/>
+          </w:tcPr>
+          <w:p>
+            <w:r>
+              <w:t>Online</w:t>
             </w:r>
           </w:p>
         </w:tc>
@@ -377,26 +1127,41 @@
       <w:tr>
         <w:tc>
           <w:tcPr>
-            <w:tcW w:w="1502" w:type="dxa"/>
-          </w:tcPr>
-          <w:p>
-            <w:pPr>
-              <w:jc w:val="center"/>
-            </w:pPr>
-            <w:r>
-              <w:lastRenderedPageBreak/>
-              <w:t>Vedam Classes</w:t>
-            </w:r>
-          </w:p>
-        </w:tc>
-        <w:tc>
-          <w:tcPr>
-            <w:tcW w:w="1502" w:type="dxa"/>
-          </w:tcPr>
-          <w:p>
-            <w:pPr>
-              <w:jc w:val="center"/>
-            </w:pPr>
+            <w:tcW w:w="1504" w:type="dxa"/>
+            <w:tcBorders>
+              <w:top w:val="single" w:sz="4" w:space="0" w:color="000000"/>
+              <w:left w:val="single" w:sz="4" w:space="0" w:color="000000"/>
+              <w:bottom w:val="single" w:sz="4" w:space="0" w:color="000000"/>
+              <w:right w:val="single" w:sz="4" w:space="0" w:color="000000"/>
+            </w:tcBorders>
+            <w:shd w:val="clear" w:color="auto" w:fill="FFFFFF"/>
+            <w:vAlign w:val="center"/>
+            <w:hideMark/>
+          </w:tcPr>
+          <w:p>
+            <w:r>
+              <w:t>Group 2</w:t>
+            </w:r>
+            <w:r>
+              <w:br/>
+              <w:t>Registered only</w:t>
+            </w:r>
+          </w:p>
+        </w:tc>
+        <w:tc>
+          <w:tcPr>
+            <w:tcW w:w="1504" w:type="dxa"/>
+            <w:tcBorders>
+              <w:top w:val="single" w:sz="4" w:space="0" w:color="000000"/>
+              <w:left w:val="single" w:sz="4" w:space="0" w:color="000000"/>
+              <w:bottom w:val="single" w:sz="4" w:space="0" w:color="000000"/>
+              <w:right w:val="single" w:sz="4" w:space="0" w:color="000000"/>
+            </w:tcBorders>
+            <w:shd w:val="clear" w:color="auto" w:fill="FFFFFF"/>
+            <w:vAlign w:val="center"/>
+            <w:hideMark/>
+          </w:tcPr>
+          <w:p>
             <w:r>
               <w:t>Online</w:t>
             </w:r>
@@ -404,53 +1169,77 @@
         </w:tc>
         <w:tc>
           <w:tcPr>
-            <w:tcW w:w="1503" w:type="dxa"/>
-          </w:tcPr>
-          <w:p>
-            <w:pPr>
-              <w:jc w:val="center"/>
-            </w:pPr>
-            <w:r>
-              <w:t>Fridays</w:t>
-            </w:r>
-          </w:p>
-        </w:tc>
-        <w:tc>
-          <w:tcPr>
-            <w:tcW w:w="1503" w:type="dxa"/>
-          </w:tcPr>
-          <w:p>
-            <w:pPr>
-              <w:jc w:val="center"/>
-            </w:pPr>
-            <w:r>
-              <w:t>11.30-12.30hrs</w:t>
-            </w:r>
-          </w:p>
-        </w:tc>
-        <w:tc>
-          <w:tcPr>
-            <w:tcW w:w="1503" w:type="dxa"/>
-          </w:tcPr>
-          <w:p>
-            <w:pPr>
-              <w:jc w:val="center"/>
-            </w:pPr>
-            <w:r>
-              <w:t>Adults</w:t>
-            </w:r>
-          </w:p>
-        </w:tc>
-        <w:tc>
-          <w:tcPr>
-            <w:tcW w:w="1503" w:type="dxa"/>
-          </w:tcPr>
-          <w:p>
-            <w:pPr>
-              <w:jc w:val="center"/>
-            </w:pPr>
-            <w:r>
-              <w:t>India (Karnataka)</w:t>
+            <w:tcW w:w="1504" w:type="dxa"/>
+            <w:tcBorders>
+              <w:top w:val="single" w:sz="4" w:space="0" w:color="000000"/>
+              <w:left w:val="single" w:sz="4" w:space="0" w:color="000000"/>
+              <w:bottom w:val="single" w:sz="4" w:space="0" w:color="000000"/>
+              <w:right w:val="single" w:sz="4" w:space="0" w:color="000000"/>
+            </w:tcBorders>
+            <w:shd w:val="clear" w:color="auto" w:fill="FFFFFF"/>
+            <w:vAlign w:val="center"/>
+            <w:hideMark/>
+          </w:tcPr>
+          <w:p>
+            <w:r>
+              <w:t>Friday</w:t>
+            </w:r>
+          </w:p>
+        </w:tc>
+        <w:tc>
+          <w:tcPr>
+            <w:tcW w:w="1504" w:type="dxa"/>
+            <w:tcBorders>
+              <w:top w:val="single" w:sz="4" w:space="0" w:color="000000"/>
+              <w:left w:val="single" w:sz="4" w:space="0" w:color="000000"/>
+              <w:bottom w:val="single" w:sz="4" w:space="0" w:color="000000"/>
+              <w:right w:val="single" w:sz="4" w:space="0" w:color="000000"/>
+            </w:tcBorders>
+            <w:shd w:val="clear" w:color="auto" w:fill="FFFFFF"/>
+            <w:vAlign w:val="center"/>
+            <w:hideMark/>
+          </w:tcPr>
+          <w:p>
+            <w:r>
+              <w:t>20:00–21:00</w:t>
+            </w:r>
+          </w:p>
+        </w:tc>
+        <w:tc>
+          <w:tcPr>
+            <w:tcW w:w="1504" w:type="dxa"/>
+            <w:tcBorders>
+              <w:top w:val="single" w:sz="4" w:space="0" w:color="000000"/>
+              <w:left w:val="single" w:sz="4" w:space="0" w:color="000000"/>
+              <w:bottom w:val="single" w:sz="4" w:space="0" w:color="000000"/>
+              <w:right w:val="single" w:sz="4" w:space="0" w:color="000000"/>
+            </w:tcBorders>
+            <w:shd w:val="clear" w:color="auto" w:fill="FFFFFF"/>
+            <w:vAlign w:val="center"/>
+            <w:hideMark/>
+          </w:tcPr>
+          <w:p>
+            <w:r>
+              <w:t>Children</w:t>
+            </w:r>
+          </w:p>
+        </w:tc>
+        <w:tc>
+          <w:tcPr>
+            <w:tcW w:w="1504" w:type="dxa"/>
+            <w:tcBorders>
+              <w:top w:val="single" w:sz="4" w:space="0" w:color="000000"/>
+              <w:left w:val="single" w:sz="4" w:space="0" w:color="000000"/>
+              <w:bottom w:val="single" w:sz="4" w:space="0" w:color="000000"/>
+              <w:right w:val="single" w:sz="4" w:space="0" w:color="000000"/>
+            </w:tcBorders>
+            <w:shd w:val="clear" w:color="auto" w:fill="FFFFFF"/>
+            <w:vAlign w:val="center"/>
+            <w:hideMark/>
+          </w:tcPr>
+          <w:p>
+            <w:r>
+              <w:t>Online</w:t>
             </w:r>
           </w:p>
         </w:tc>
@@ -458,133 +1247,120 @@
       <w:tr>
         <w:tc>
           <w:tcPr>
-            <w:tcW w:w="1502" w:type="dxa"/>
-          </w:tcPr>
-          <w:p>
-            <w:pPr>
-              <w:jc w:val="center"/>
-            </w:pPr>
-            <w:r>
-              <w:t>Vedam Classes</w:t>
-            </w:r>
-          </w:p>
-        </w:tc>
-        <w:tc>
-          <w:tcPr>
-            <w:tcW w:w="1502" w:type="dxa"/>
-          </w:tcPr>
-          <w:p>
-            <w:pPr>
-              <w:jc w:val="center"/>
-            </w:pPr>
-            <w:r>
-              <w:t>Face-to-Face</w:t>
-            </w:r>
-          </w:p>
-        </w:tc>
-        <w:tc>
-          <w:tcPr>
-            <w:tcW w:w="1503" w:type="dxa"/>
-          </w:tcPr>
-          <w:p>
-            <w:pPr>
-              <w:jc w:val="center"/>
-            </w:pPr>
-            <w:r>
-              <w:t>Saturdays</w:t>
-            </w:r>
-          </w:p>
-        </w:tc>
-        <w:tc>
-          <w:tcPr>
-            <w:tcW w:w="1503" w:type="dxa"/>
-          </w:tcPr>
-          <w:p>
-            <w:pPr>
-              <w:jc w:val="center"/>
-            </w:pPr>
-            <w:r>
-              <w:t>15.30-16.30hrs</w:t>
-            </w:r>
-          </w:p>
-        </w:tc>
-        <w:tc>
-          <w:tcPr>
-            <w:tcW w:w="1503" w:type="dxa"/>
-          </w:tcPr>
-          <w:p>
-            <w:pPr>
-              <w:jc w:val="center"/>
-            </w:pPr>
-            <w:r>
-              <w:t>Children &amp; Adults</w:t>
-            </w:r>
-          </w:p>
-        </w:tc>
-        <w:tc>
-          <w:tcPr>
-            <w:tcW w:w="1503" w:type="dxa"/>
-          </w:tcPr>
-          <w:p>
-            <w:pPr>
-              <w:pStyle w:val="NormalWeb"/>
-              <w:spacing w:before="0" w:beforeAutospacing="0" w:after="0" w:afterAutospacing="0"/>
-            </w:pPr>
-            <w:r>
-              <w:rPr>
-                <w:rFonts w:ascii="Arial" w:hAnsi="Arial" w:cs="Arial"/>
-                <w:color w:val="1D2528"/>
-              </w:rPr>
-              <w:t xml:space="preserve">St. </w:t>
-            </w:r>
-            <w:proofErr w:type="spellStart"/>
-            <w:r>
-              <w:rPr>
-                <w:rFonts w:ascii="Arial" w:hAnsi="Arial" w:cs="Arial"/>
-                <w:color w:val="1D2528"/>
-              </w:rPr>
-              <w:t>Aidans</w:t>
-            </w:r>
-            <w:proofErr w:type="spellEnd"/>
-            <w:r>
-              <w:rPr>
-                <w:rFonts w:ascii="Arial" w:hAnsi="Arial" w:cs="Arial"/>
-                <w:color w:val="1D2528"/>
-              </w:rPr>
-              <w:t xml:space="preserve"> Community Centre</w:t>
-            </w:r>
-          </w:p>
-          <w:p>
-            <w:pPr>
-              <w:pStyle w:val="NormalWeb"/>
-              <w:spacing w:before="0" w:beforeAutospacing="0" w:after="0" w:afterAutospacing="0"/>
-            </w:pPr>
-            <w:r>
-              <w:rPr>
-                <w:rFonts w:ascii="Arial" w:hAnsi="Arial" w:cs="Arial"/>
-                <w:color w:val="1D2528"/>
-              </w:rPr>
-              <w:t>Princes Rd, Newcastle upon Tyne</w:t>
-            </w:r>
-          </w:p>
-          <w:p>
-            <w:pPr>
-              <w:pStyle w:val="NormalWeb"/>
-              <w:spacing w:before="0" w:beforeAutospacing="0" w:after="0" w:afterAutospacing="0"/>
-            </w:pPr>
-            <w:r>
-              <w:rPr>
-                <w:rFonts w:ascii="Arial" w:hAnsi="Arial" w:cs="Arial"/>
-                <w:color w:val="1D2528"/>
-              </w:rPr>
-              <w:t>NE3 5TT</w:t>
-            </w:r>
-            <w:r>
-              <w:rPr>
-                <w:rFonts w:ascii="Arial" w:hAnsi="Arial" w:cs="Arial"/>
-                <w:color w:val="1D2528"/>
-              </w:rPr>
-              <w:t xml:space="preserve"> , UK</w:t>
+            <w:tcW w:w="1504" w:type="dxa"/>
+            <w:tcBorders>
+              <w:top w:val="single" w:sz="4" w:space="0" w:color="000000"/>
+              <w:left w:val="single" w:sz="4" w:space="0" w:color="000000"/>
+              <w:bottom w:val="single" w:sz="4" w:space="0" w:color="000000"/>
+              <w:right w:val="single" w:sz="4" w:space="0" w:color="000000"/>
+            </w:tcBorders>
+            <w:shd w:val="clear" w:color="auto" w:fill="FFFFFF"/>
+            <w:vAlign w:val="center"/>
+            <w:hideMark/>
+          </w:tcPr>
+          <w:p>
+            <w:r>
+              <w:lastRenderedPageBreak/>
+              <w:t>Group 3</w:t>
+            </w:r>
+            <w:r>
+              <w:br/>
+              <w:t>Registered only</w:t>
+            </w:r>
+          </w:p>
+        </w:tc>
+        <w:tc>
+          <w:tcPr>
+            <w:tcW w:w="1504" w:type="dxa"/>
+            <w:tcBorders>
+              <w:top w:val="single" w:sz="4" w:space="0" w:color="000000"/>
+              <w:left w:val="single" w:sz="4" w:space="0" w:color="000000"/>
+              <w:bottom w:val="single" w:sz="4" w:space="0" w:color="000000"/>
+              <w:right w:val="single" w:sz="4" w:space="0" w:color="000000"/>
+            </w:tcBorders>
+            <w:shd w:val="clear" w:color="auto" w:fill="FFFFFF"/>
+            <w:vAlign w:val="center"/>
+            <w:hideMark/>
+          </w:tcPr>
+          <w:p>
+            <w:r>
+              <w:t>Online</w:t>
+            </w:r>
+          </w:p>
+        </w:tc>
+        <w:tc>
+          <w:tcPr>
+            <w:tcW w:w="1504" w:type="dxa"/>
+            <w:tcBorders>
+              <w:top w:val="single" w:sz="4" w:space="0" w:color="000000"/>
+              <w:left w:val="single" w:sz="4" w:space="0" w:color="000000"/>
+              <w:bottom w:val="single" w:sz="4" w:space="0" w:color="000000"/>
+              <w:right w:val="single" w:sz="4" w:space="0" w:color="000000"/>
+            </w:tcBorders>
+            <w:shd w:val="clear" w:color="auto" w:fill="FFFFFF"/>
+            <w:vAlign w:val="center"/>
+            <w:hideMark/>
+          </w:tcPr>
+          <w:p>
+            <w:r>
+              <w:t>Wednesday</w:t>
+            </w:r>
+          </w:p>
+        </w:tc>
+        <w:tc>
+          <w:tcPr>
+            <w:tcW w:w="1504" w:type="dxa"/>
+            <w:tcBorders>
+              <w:top w:val="single" w:sz="4" w:space="0" w:color="000000"/>
+              <w:left w:val="single" w:sz="4" w:space="0" w:color="000000"/>
+              <w:bottom w:val="single" w:sz="4" w:space="0" w:color="000000"/>
+              <w:right w:val="single" w:sz="4" w:space="0" w:color="000000"/>
+            </w:tcBorders>
+            <w:shd w:val="clear" w:color="auto" w:fill="FFFFFF"/>
+            <w:vAlign w:val="center"/>
+            <w:hideMark/>
+          </w:tcPr>
+          <w:p>
+            <w:r>
+              <w:t>20:00–21:00</w:t>
+            </w:r>
+          </w:p>
+        </w:tc>
+        <w:tc>
+          <w:tcPr>
+            <w:tcW w:w="1504" w:type="dxa"/>
+            <w:tcBorders>
+              <w:top w:val="single" w:sz="4" w:space="0" w:color="000000"/>
+              <w:left w:val="single" w:sz="4" w:space="0" w:color="000000"/>
+              <w:bottom w:val="single" w:sz="4" w:space="0" w:color="000000"/>
+              <w:right w:val="single" w:sz="4" w:space="0" w:color="000000"/>
+            </w:tcBorders>
+            <w:shd w:val="clear" w:color="auto" w:fill="FFFFFF"/>
+            <w:vAlign w:val="center"/>
+            <w:hideMark/>
+          </w:tcPr>
+          <w:p>
+            <w:r>
+              <w:t>Children</w:t>
+            </w:r>
+          </w:p>
+        </w:tc>
+        <w:tc>
+          <w:tcPr>
+            <w:tcW w:w="1504" w:type="dxa"/>
+            <w:tcBorders>
+              <w:top w:val="single" w:sz="4" w:space="0" w:color="000000"/>
+              <w:left w:val="single" w:sz="4" w:space="0" w:color="000000"/>
+              <w:bottom w:val="single" w:sz="4" w:space="0" w:color="000000"/>
+              <w:right w:val="single" w:sz="4" w:space="0" w:color="000000"/>
+            </w:tcBorders>
+            <w:shd w:val="clear" w:color="auto" w:fill="FFFFFF"/>
+            <w:vAlign w:val="center"/>
+            <w:hideMark/>
+          </w:tcPr>
+          <w:p>
+            <w:r>
+              <w:t>Online</w:t>
             </w:r>
           </w:p>
         </w:tc>
@@ -592,184 +1368,349 @@
       <w:tr>
         <w:tc>
           <w:tcPr>
-            <w:tcW w:w="1502" w:type="dxa"/>
-          </w:tcPr>
-          <w:p>
-            <w:pPr>
-              <w:jc w:val="center"/>
-            </w:pPr>
-            <w:r>
-              <w:t>Dharma Sundays</w:t>
-            </w:r>
-          </w:p>
-        </w:tc>
-        <w:tc>
-          <w:tcPr>
-            <w:tcW w:w="1502" w:type="dxa"/>
-          </w:tcPr>
-          <w:p>
-            <w:pPr>
-              <w:jc w:val="center"/>
-            </w:pPr>
-            <w:r>
-              <w:t>Face-to-Face</w:t>
-            </w:r>
-          </w:p>
-        </w:tc>
-        <w:tc>
-          <w:tcPr>
-            <w:tcW w:w="1503" w:type="dxa"/>
-          </w:tcPr>
-          <w:p>
-            <w:pPr>
-              <w:jc w:val="center"/>
-            </w:pPr>
-            <w:r>
-              <w:t>Sundays</w:t>
-            </w:r>
-          </w:p>
-        </w:tc>
-        <w:tc>
-          <w:tcPr>
-            <w:tcW w:w="1503" w:type="dxa"/>
-          </w:tcPr>
-          <w:p>
-            <w:pPr>
-              <w:jc w:val="center"/>
-            </w:pPr>
-            <w:r>
-              <w:t>11.30-13.00hrs</w:t>
-            </w:r>
-          </w:p>
-        </w:tc>
-        <w:tc>
-          <w:tcPr>
-            <w:tcW w:w="1503" w:type="dxa"/>
-          </w:tcPr>
-          <w:p>
-            <w:pPr>
-              <w:jc w:val="center"/>
-            </w:pPr>
-            <w:r>
-              <w:t>Children (&amp; Parents)</w:t>
-            </w:r>
-          </w:p>
-        </w:tc>
-        <w:tc>
-          <w:tcPr>
-            <w:tcW w:w="1503" w:type="dxa"/>
-          </w:tcPr>
-          <w:p>
-            <w:pPr>
-              <w:jc w:val="center"/>
-            </w:pPr>
-            <w:r>
-              <w:t>UK</w:t>
+            <w:tcW w:w="1504" w:type="dxa"/>
+            <w:tcBorders>
+              <w:top w:val="single" w:sz="4" w:space="0" w:color="000000"/>
+              <w:left w:val="single" w:sz="4" w:space="0" w:color="000000"/>
+              <w:bottom w:val="single" w:sz="4" w:space="0" w:color="000000"/>
+              <w:right w:val="single" w:sz="4" w:space="0" w:color="000000"/>
+            </w:tcBorders>
+            <w:shd w:val="clear" w:color="auto" w:fill="FFFFFF"/>
+            <w:vAlign w:val="center"/>
+            <w:hideMark/>
+          </w:tcPr>
+          <w:p>
+            <w:r>
+              <w:t>Group 4</w:t>
+            </w:r>
+            <w:r>
+              <w:br/>
+              <w:t>Registered only</w:t>
+            </w:r>
+          </w:p>
+        </w:tc>
+        <w:tc>
+          <w:tcPr>
+            <w:tcW w:w="1504" w:type="dxa"/>
+            <w:tcBorders>
+              <w:top w:val="single" w:sz="4" w:space="0" w:color="000000"/>
+              <w:left w:val="single" w:sz="4" w:space="0" w:color="000000"/>
+              <w:bottom w:val="single" w:sz="4" w:space="0" w:color="000000"/>
+              <w:right w:val="single" w:sz="4" w:space="0" w:color="000000"/>
+            </w:tcBorders>
+            <w:shd w:val="clear" w:color="auto" w:fill="FFFFFF"/>
+            <w:vAlign w:val="center"/>
+            <w:hideMark/>
+          </w:tcPr>
+          <w:p>
+            <w:r>
+              <w:t>Online</w:t>
+            </w:r>
+          </w:p>
+        </w:tc>
+        <w:tc>
+          <w:tcPr>
+            <w:tcW w:w="1504" w:type="dxa"/>
+            <w:tcBorders>
+              <w:top w:val="single" w:sz="4" w:space="0" w:color="000000"/>
+              <w:left w:val="single" w:sz="4" w:space="0" w:color="000000"/>
+              <w:bottom w:val="single" w:sz="4" w:space="0" w:color="000000"/>
+              <w:right w:val="single" w:sz="4" w:space="0" w:color="000000"/>
+            </w:tcBorders>
+            <w:shd w:val="clear" w:color="auto" w:fill="FFFFFF"/>
+            <w:vAlign w:val="center"/>
+            <w:hideMark/>
+          </w:tcPr>
+          <w:p>
+            <w:r>
+              <w:t>Monday</w:t>
+            </w:r>
+          </w:p>
+        </w:tc>
+        <w:tc>
+          <w:tcPr>
+            <w:tcW w:w="1504" w:type="dxa"/>
+            <w:tcBorders>
+              <w:top w:val="single" w:sz="4" w:space="0" w:color="000000"/>
+              <w:left w:val="single" w:sz="4" w:space="0" w:color="000000"/>
+              <w:bottom w:val="single" w:sz="4" w:space="0" w:color="000000"/>
+              <w:right w:val="single" w:sz="4" w:space="0" w:color="000000"/>
+            </w:tcBorders>
+            <w:shd w:val="clear" w:color="auto" w:fill="FFFFFF"/>
+            <w:vAlign w:val="center"/>
+            <w:hideMark/>
+          </w:tcPr>
+          <w:p>
+            <w:r>
+              <w:t>18:00–19:00</w:t>
+            </w:r>
+          </w:p>
+        </w:tc>
+        <w:tc>
+          <w:tcPr>
+            <w:tcW w:w="1504" w:type="dxa"/>
+            <w:tcBorders>
+              <w:top w:val="single" w:sz="4" w:space="0" w:color="000000"/>
+              <w:left w:val="single" w:sz="4" w:space="0" w:color="000000"/>
+              <w:bottom w:val="single" w:sz="4" w:space="0" w:color="000000"/>
+              <w:right w:val="single" w:sz="4" w:space="0" w:color="000000"/>
+            </w:tcBorders>
+            <w:shd w:val="clear" w:color="auto" w:fill="FFFFFF"/>
+            <w:vAlign w:val="center"/>
+            <w:hideMark/>
+          </w:tcPr>
+          <w:p>
+            <w:r>
+              <w:t>Children</w:t>
+            </w:r>
+          </w:p>
+        </w:tc>
+        <w:tc>
+          <w:tcPr>
+            <w:tcW w:w="1504" w:type="dxa"/>
+            <w:tcBorders>
+              <w:top w:val="single" w:sz="4" w:space="0" w:color="000000"/>
+              <w:left w:val="single" w:sz="4" w:space="0" w:color="000000"/>
+              <w:bottom w:val="single" w:sz="4" w:space="0" w:color="000000"/>
+              <w:right w:val="single" w:sz="4" w:space="0" w:color="000000"/>
+            </w:tcBorders>
+            <w:shd w:val="clear" w:color="auto" w:fill="FFFFFF"/>
+            <w:vAlign w:val="center"/>
+            <w:hideMark/>
+          </w:tcPr>
+          <w:p>
+            <w:r>
+              <w:t>Online</w:t>
+            </w:r>
+          </w:p>
+        </w:tc>
+      </w:tr>
+      <w:tr>
+        <w:tc>
+          <w:tcPr>
+            <w:tcW w:w="1504" w:type="dxa"/>
+            <w:tcBorders>
+              <w:top w:val="single" w:sz="4" w:space="0" w:color="000000"/>
+              <w:left w:val="single" w:sz="4" w:space="0" w:color="000000"/>
+              <w:bottom w:val="single" w:sz="4" w:space="0" w:color="000000"/>
+              <w:right w:val="single" w:sz="4" w:space="0" w:color="000000"/>
+            </w:tcBorders>
+            <w:shd w:val="clear" w:color="auto" w:fill="FFFFFF"/>
+            <w:vAlign w:val="center"/>
+            <w:hideMark/>
+          </w:tcPr>
+          <w:p>
+            <w:r>
+              <w:t>Group 5</w:t>
+            </w:r>
+            <w:r>
+              <w:br/>
+              <w:t>Registered only</w:t>
+            </w:r>
+          </w:p>
+        </w:tc>
+        <w:tc>
+          <w:tcPr>
+            <w:tcW w:w="1504" w:type="dxa"/>
+            <w:tcBorders>
+              <w:top w:val="single" w:sz="4" w:space="0" w:color="000000"/>
+              <w:left w:val="single" w:sz="4" w:space="0" w:color="000000"/>
+              <w:bottom w:val="single" w:sz="4" w:space="0" w:color="000000"/>
+              <w:right w:val="single" w:sz="4" w:space="0" w:color="000000"/>
+            </w:tcBorders>
+            <w:shd w:val="clear" w:color="auto" w:fill="FFFFFF"/>
+            <w:vAlign w:val="center"/>
+            <w:hideMark/>
+          </w:tcPr>
+          <w:p>
+            <w:r>
+              <w:t>Online</w:t>
+            </w:r>
+          </w:p>
+        </w:tc>
+        <w:tc>
+          <w:tcPr>
+            <w:tcW w:w="1504" w:type="dxa"/>
+            <w:tcBorders>
+              <w:top w:val="single" w:sz="4" w:space="0" w:color="000000"/>
+              <w:left w:val="single" w:sz="4" w:space="0" w:color="000000"/>
+              <w:bottom w:val="single" w:sz="4" w:space="0" w:color="000000"/>
+              <w:right w:val="single" w:sz="4" w:space="0" w:color="000000"/>
+            </w:tcBorders>
+            <w:shd w:val="clear" w:color="auto" w:fill="FFFFFF"/>
+            <w:vAlign w:val="center"/>
+            <w:hideMark/>
+          </w:tcPr>
+          <w:p>
+            <w:r>
+              <w:t>Wednesday</w:t>
+            </w:r>
+          </w:p>
+        </w:tc>
+        <w:tc>
+          <w:tcPr>
+            <w:tcW w:w="1504" w:type="dxa"/>
+            <w:tcBorders>
+              <w:top w:val="single" w:sz="4" w:space="0" w:color="000000"/>
+              <w:left w:val="single" w:sz="4" w:space="0" w:color="000000"/>
+              <w:bottom w:val="single" w:sz="4" w:space="0" w:color="000000"/>
+              <w:right w:val="single" w:sz="4" w:space="0" w:color="000000"/>
+            </w:tcBorders>
+            <w:shd w:val="clear" w:color="auto" w:fill="FFFFFF"/>
+            <w:vAlign w:val="center"/>
+            <w:hideMark/>
+          </w:tcPr>
+          <w:p>
+            <w:r>
+              <w:t>17:00–18:00</w:t>
+            </w:r>
+          </w:p>
+        </w:tc>
+        <w:tc>
+          <w:tcPr>
+            <w:tcW w:w="1504" w:type="dxa"/>
+            <w:tcBorders>
+              <w:top w:val="single" w:sz="4" w:space="0" w:color="000000"/>
+              <w:left w:val="single" w:sz="4" w:space="0" w:color="000000"/>
+              <w:bottom w:val="single" w:sz="4" w:space="0" w:color="000000"/>
+              <w:right w:val="single" w:sz="4" w:space="0" w:color="000000"/>
+            </w:tcBorders>
+            <w:shd w:val="clear" w:color="auto" w:fill="FFFFFF"/>
+            <w:vAlign w:val="center"/>
+            <w:hideMark/>
+          </w:tcPr>
+          <w:p>
+            <w:r>
+              <w:t>Children</w:t>
+            </w:r>
+          </w:p>
+        </w:tc>
+        <w:tc>
+          <w:tcPr>
+            <w:tcW w:w="1504" w:type="dxa"/>
+            <w:tcBorders>
+              <w:top w:val="single" w:sz="4" w:space="0" w:color="000000"/>
+              <w:left w:val="single" w:sz="4" w:space="0" w:color="000000"/>
+              <w:bottom w:val="single" w:sz="4" w:space="0" w:color="000000"/>
+              <w:right w:val="single" w:sz="4" w:space="0" w:color="000000"/>
+            </w:tcBorders>
+            <w:shd w:val="clear" w:color="auto" w:fill="FFFFFF"/>
+            <w:vAlign w:val="center"/>
+            <w:hideMark/>
+          </w:tcPr>
+          <w:p>
+            <w:r>
+              <w:t>Online</w:t>
             </w:r>
           </w:p>
         </w:tc>
       </w:tr>
     </w:tbl>
     <w:p/>
-    <w:p/>
-    <w:p>
-      <w:pPr>
-        <w:rPr>
-          <w:i/>
-          <w:iCs/>
-        </w:rPr>
-      </w:pPr>
-      <w:r>
-        <w:rPr>
-          <w:i/>
-          <w:iCs/>
-        </w:rPr>
-        <w:t>Dharma Sundays</w:t>
-      </w:r>
-    </w:p>
-    <w:p>
-      <w:r>
-        <w:t xml:space="preserve">Dharma Sundays are unique sessions started by teachers </w:t>
-      </w:r>
-      <w:r>
-        <w:t>in the</w:t>
-      </w:r>
-      <w:r>
-        <w:t xml:space="preserve"> </w:t>
-      </w:r>
-      <w:r>
-        <w:t>Śruti</w:t>
-      </w:r>
-      <w:r>
-        <w:t xml:space="preserve"> school to teach children the concepts of Vedas and Vedanta. They achieve this aim by teaching in depth concepts using lively story telling techniques</w:t>
-      </w:r>
-      <w:r>
-        <w:t xml:space="preserve"> from the </w:t>
-      </w:r>
-      <w:proofErr w:type="spellStart"/>
-      <w:r>
-        <w:t>Smruthis</w:t>
-      </w:r>
-      <w:proofErr w:type="spellEnd"/>
-      <w:r>
-        <w:t xml:space="preserve">. </w:t>
-      </w:r>
-    </w:p>
-    <w:p/>
-    <w:p>
-      <w:pPr>
+    <w:p>
+      <w:r>
         <w:rPr>
           <w:b/>
           <w:bCs/>
         </w:rPr>
-      </w:pPr>
-      <w:r>
+        <w:t xml:space="preserve">Please note: </w:t>
+      </w:r>
+      <w:r>
+        <w:t>Sessions marked “Registered only” are available to existing registered participants and are not open drop-in sessions.</w:t>
+      </w:r>
+    </w:p>
+    <w:p/>
+    <w:p>
+      <w:pPr>
         <w:rPr>
           <w:b/>
           <w:bCs/>
         </w:rPr>
-        <w:t>Performing Arts</w:t>
-      </w:r>
-    </w:p>
-    <w:p>
-      <w:r>
-        <w:t xml:space="preserve">Performing Arts form a major part of </w:t>
-      </w:r>
-      <w:r>
-        <w:t xml:space="preserve">Śruti </w:t>
-      </w:r>
-      <w:r>
-        <w:t>`s plans. We believe that the best way to make children aware of their innate good values is through Dramas</w:t>
-      </w:r>
-      <w:r>
-        <w:t>,</w:t>
-      </w:r>
-      <w:r>
-        <w:t xml:space="preserve"> Musical Productions</w:t>
-      </w:r>
-      <w:r>
-        <w:t xml:space="preserve"> and Pantomimes</w:t>
-      </w:r>
-      <w:r>
-        <w:t xml:space="preserve">. We pick heroes who stood for Integrity, Courage, Love and Truth always doing the right things from the scriptures and plan innovative musical productions with children and adults as artists. This encourages </w:t>
-      </w:r>
-      <w:r>
-        <w:t xml:space="preserve">everyone to learn the values exhibited by the characters in the plays. </w:t>
-      </w:r>
-    </w:p>
-    <w:p/>
-    <w:p>
-      <w:pPr>
+      </w:pPr>
+      <w:r>
         <w:rPr>
           <w:b/>
           <w:bCs/>
         </w:rPr>
-      </w:pPr>
-      <w:r>
+        <w:t>Dharma Sundays</w:t>
+      </w:r>
+    </w:p>
+    <w:p>
+      <w:r>
+        <w:t xml:space="preserve">Dharma Sundays are unique face-to-face sessions started by teachers in the </w:t>
+      </w:r>
+      <w:proofErr w:type="spellStart"/>
+      <w:r>
+        <w:t>Śruti</w:t>
+      </w:r>
+      <w:proofErr w:type="spellEnd"/>
+      <w:r>
+        <w:t xml:space="preserve"> school to teach children the concepts of Vedas and Vedanta. They use lively storytelling techniques from the </w:t>
+      </w:r>
+      <w:proofErr w:type="spellStart"/>
+      <w:r>
+        <w:t>Smruthis</w:t>
+      </w:r>
+      <w:proofErr w:type="spellEnd"/>
+      <w:r>
+        <w:t xml:space="preserve"> to explore these concepts in depth. Sessions take place at Hindu Temple Newcastle, 172 West Rd, Newcastle upon Tyne, NE4 9QB, UK.</w:t>
+      </w:r>
+    </w:p>
+    <w:p/>
+    <w:p>
+      <w:pPr>
         <w:rPr>
           <w:b/>
           <w:bCs/>
         </w:rPr>
+      </w:pPr>
+      <w:r>
+        <w:rPr>
+          <w:b/>
+          <w:bCs/>
+        </w:rPr>
+        <w:t>Performing Arts</w:t>
+      </w:r>
+    </w:p>
+    <w:p>
+      <w:r>
+        <w:t xml:space="preserve">Performing Arts form a major part of </w:t>
+      </w:r>
+      <w:r>
+        <w:t xml:space="preserve">Śruti </w:t>
+      </w:r>
+      <w:r>
+        <w:t>`s plans. We believe that the best way to make children aware of their innate good values is through Dramas</w:t>
+      </w:r>
+      <w:r>
+        <w:t>,</w:t>
+      </w:r>
+      <w:r>
+        <w:t xml:space="preserve"> Musical Productions</w:t>
+      </w:r>
+      <w:r>
+        <w:t xml:space="preserve"> and Pantomimes</w:t>
+      </w:r>
+      <w:r>
+        <w:t xml:space="preserve">. We pick heroes who stood for Integrity, Courage, Love and Truth always doing the right things from the scriptures and plan innovative musical productions with children and adults as artists. This encourages </w:t>
+      </w:r>
+      <w:r>
+        <w:t xml:space="preserve">everyone to learn the values exhibited by the characters in the plays. </w:t>
+      </w:r>
+    </w:p>
+    <w:p/>
+    <w:p>
+      <w:pPr>
+        <w:rPr>
+          <w:b/>
+          <w:bCs/>
+        </w:rPr>
+      </w:pPr>
+      <w:r>
+        <w:rPr>
+          <w:b/>
+          <w:bCs/>
+        </w:rPr>
         <w:t>Selfless Service</w:t>
       </w:r>
     </w:p>
@@ -809,14 +1750,11 @@
     </w:p>
     <w:p>
       <w:r>
+        <w:lastRenderedPageBreak/>
         <w:t xml:space="preserve">Students and family members of our school joined hands with Sri Sathya Sai Organisation CIO to plant 630 trees </w:t>
       </w:r>
       <w:r>
-        <w:t xml:space="preserve">together to plant 650 trees on 18th April 2026. A team of 45 devotees including 10 children started planting trees at 10am on a bright Saturday morning at Jarrow, South Shields, Newcastle upon Tyne. They were treated </w:t>
-      </w:r>
-      <w:r>
-        <w:lastRenderedPageBreak/>
-        <w:t xml:space="preserve">with chocolates; fresh fruits and cookies in the morning and a nice lunch in the afternoon. Bluetooth speakers playing </w:t>
+        <w:t xml:space="preserve">together to plant 650 trees on 18th April 2026. A team of 45 devotees including 10 children started planting trees at 10am on a bright Saturday morning at Jarrow, South Shields, Newcastle upon Tyne. They were treated with chocolates; fresh fruits and cookies in the morning and a nice lunch in the afternoon. Bluetooth speakers playing </w:t>
       </w:r>
       <w:r>
         <w:t>melodious, spiritual music</w:t>
@@ -1592,7 +2530,6 @@
   <w:style w:type="character" w:default="1" w:styleId="DefaultParagraphFont">
     <w:name w:val="Default Paragraph Font"/>
     <w:uiPriority w:val="1"/>
-    <w:semiHidden/>
     <w:unhideWhenUsed/>
   </w:style>
   <w:style w:type="table" w:default="1" w:styleId="TableNormal">

</xml_diff>